<commit_message>
Die Gerichte im Warenkorb haben jetzt alle eine maximale Höhe damit man nicht weit nach unten scrollen muss um den Buy Now Button zu sehen und beim Logo und Warenkorb wurde die Contentbegrenzung jetzt beachtet
</commit_message>
<xml_diff>
--- a/Feedback BestellApp 1.docx
+++ b/Feedback BestellApp 1.docx
@@ -56,13 +56,15 @@
           <w:rFonts w:ascii="Arial" w:hAnsi="Arial" w:cs="Arial"/>
           <w:sz w:val="22"/>
           <w:szCs w:val="22"/>
-        </w:rPr>
-      </w:pPr>
-      <w:r>
-        <w:rPr>
-          <w:rFonts w:ascii="Arial" w:hAnsi="Arial" w:cs="Arial"/>
-          <w:sz w:val="22"/>
-          <w:szCs w:val="22"/>
+          <w:highlight w:val="yellow"/>
+        </w:rPr>
+      </w:pPr>
+      <w:r>
+        <w:rPr>
+          <w:rFonts w:ascii="Arial" w:hAnsi="Arial" w:cs="Arial"/>
+          <w:sz w:val="22"/>
+          <w:szCs w:val="22"/>
+          <w:highlight w:val="yellow"/>
         </w:rPr>
         <w:t xml:space="preserve">Falsches </w:t>
       </w:r>
@@ -72,6 +74,7 @@
           <w:rFonts w:ascii="Arial" w:hAnsi="Arial" w:cs="Arial"/>
           <w:sz w:val="22"/>
           <w:szCs w:val="22"/>
+          <w:highlight w:val="yellow"/>
         </w:rPr>
         <w:t>Respository</w:t>
       </w:r>
@@ -81,6 +84,7 @@
           <w:rFonts w:ascii="Arial" w:hAnsi="Arial" w:cs="Arial"/>
           <w:sz w:val="22"/>
           <w:szCs w:val="22"/>
+          <w:highlight w:val="yellow"/>
         </w:rPr>
         <w:t xml:space="preserve"> das </w:t>
       </w:r>
@@ -90,6 +94,7 @@
           <w:rFonts w:ascii="Arial" w:hAnsi="Arial" w:cs="Arial"/>
           <w:sz w:val="22"/>
           <w:szCs w:val="22"/>
+          <w:highlight w:val="yellow"/>
         </w:rPr>
         <w:t>Respository</w:t>
       </w:r>
@@ -99,6 +104,7 @@
           <w:rFonts w:ascii="Arial" w:hAnsi="Arial" w:cs="Arial"/>
           <w:sz w:val="22"/>
           <w:szCs w:val="22"/>
+          <w:highlight w:val="yellow"/>
         </w:rPr>
         <w:t xml:space="preserve"> führt ins Leere hochgeladen darauf </w:t>
       </w:r>
@@ -108,6 +114,7 @@
           <w:rFonts w:ascii="Arial" w:hAnsi="Arial" w:cs="Arial"/>
           <w:sz w:val="22"/>
           <w:szCs w:val="22"/>
+          <w:highlight w:val="yellow"/>
         </w:rPr>
         <w:t>achten</w:t>
       </w:r>
@@ -117,6 +124,7 @@
           <w:rFonts w:ascii="Arial" w:hAnsi="Arial" w:cs="Arial"/>
           <w:sz w:val="22"/>
           <w:szCs w:val="22"/>
+          <w:highlight w:val="yellow"/>
         </w:rPr>
         <w:t xml:space="preserve"> dass man das richtige </w:t>
       </w:r>
@@ -126,6 +134,7 @@
           <w:rFonts w:ascii="Arial" w:hAnsi="Arial" w:cs="Arial"/>
           <w:sz w:val="22"/>
           <w:szCs w:val="22"/>
+          <w:highlight w:val="yellow"/>
         </w:rPr>
         <w:t>Respository</w:t>
       </w:r>
@@ -135,6 +144,7 @@
           <w:rFonts w:ascii="Arial" w:hAnsi="Arial" w:cs="Arial"/>
           <w:sz w:val="22"/>
           <w:szCs w:val="22"/>
+          <w:highlight w:val="yellow"/>
         </w:rPr>
         <w:t xml:space="preserve"> abgibt</w:t>
       </w:r>
@@ -150,13 +160,15 @@
           <w:rFonts w:ascii="Arial" w:hAnsi="Arial" w:cs="Arial"/>
           <w:sz w:val="22"/>
           <w:szCs w:val="22"/>
-        </w:rPr>
-      </w:pPr>
-      <w:r>
-        <w:rPr>
-          <w:rFonts w:ascii="Arial" w:hAnsi="Arial" w:cs="Arial"/>
-          <w:sz w:val="22"/>
-          <w:szCs w:val="22"/>
+          <w:highlight w:val="yellow"/>
+        </w:rPr>
+      </w:pPr>
+      <w:r>
+        <w:rPr>
+          <w:rFonts w:ascii="Arial" w:hAnsi="Arial" w:cs="Arial"/>
+          <w:sz w:val="22"/>
+          <w:szCs w:val="22"/>
+          <w:highlight w:val="yellow"/>
         </w:rPr>
         <w:t xml:space="preserve">Es gibt mehrere </w:t>
       </w:r>
@@ -166,6 +178,7 @@
           <w:rFonts w:ascii="Arial" w:hAnsi="Arial" w:cs="Arial"/>
           <w:sz w:val="22"/>
           <w:szCs w:val="22"/>
+          <w:highlight w:val="yellow"/>
         </w:rPr>
         <w:t>BestellApp</w:t>
       </w:r>
@@ -175,6 +188,7 @@
           <w:rFonts w:ascii="Arial" w:hAnsi="Arial" w:cs="Arial"/>
           <w:sz w:val="22"/>
           <w:szCs w:val="22"/>
+          <w:highlight w:val="yellow"/>
         </w:rPr>
         <w:t xml:space="preserve"> </w:t>
       </w:r>
@@ -184,6 +198,7 @@
           <w:rFonts w:ascii="Arial" w:hAnsi="Arial" w:cs="Arial"/>
           <w:sz w:val="22"/>
           <w:szCs w:val="22"/>
+          <w:highlight w:val="yellow"/>
         </w:rPr>
         <w:t>Respositorys</w:t>
       </w:r>
@@ -193,6 +208,7 @@
           <w:rFonts w:ascii="Arial" w:hAnsi="Arial" w:cs="Arial"/>
           <w:sz w:val="22"/>
           <w:szCs w:val="22"/>
+          <w:highlight w:val="yellow"/>
         </w:rPr>
         <w:t xml:space="preserve"> darauf </w:t>
       </w:r>
@@ -202,6 +218,7 @@
           <w:rFonts w:ascii="Arial" w:hAnsi="Arial" w:cs="Arial"/>
           <w:sz w:val="22"/>
           <w:szCs w:val="22"/>
+          <w:highlight w:val="yellow"/>
         </w:rPr>
         <w:t>achten</w:t>
       </w:r>
@@ -211,6 +228,7 @@
           <w:rFonts w:ascii="Arial" w:hAnsi="Arial" w:cs="Arial"/>
           <w:sz w:val="22"/>
           <w:szCs w:val="22"/>
+          <w:highlight w:val="yellow"/>
         </w:rPr>
         <w:t xml:space="preserve"> dass es nur eine gibt und dass man die richtige verlinkt</w:t>
       </w:r>
@@ -249,13 +267,15 @@
           <w:rFonts w:ascii="Arial" w:hAnsi="Arial" w:cs="Arial"/>
           <w:sz w:val="22"/>
           <w:szCs w:val="22"/>
-        </w:rPr>
-      </w:pPr>
-      <w:r>
-        <w:rPr>
-          <w:rFonts w:ascii="Arial" w:hAnsi="Arial" w:cs="Arial"/>
-          <w:sz w:val="22"/>
-          <w:szCs w:val="22"/>
+          <w:highlight w:val="yellow"/>
+        </w:rPr>
+      </w:pPr>
+      <w:r>
+        <w:rPr>
+          <w:rFonts w:ascii="Arial" w:hAnsi="Arial" w:cs="Arial"/>
+          <w:sz w:val="22"/>
+          <w:szCs w:val="22"/>
+          <w:highlight w:val="yellow"/>
         </w:rPr>
         <w:t>Copyright Zeichen anpassen bei mir ist es nur ein C</w:t>
       </w:r>
@@ -301,6 +321,7 @@
           <w:rFonts w:ascii="Arial" w:hAnsi="Arial" w:cs="Arial"/>
           <w:sz w:val="22"/>
           <w:szCs w:val="22"/>
+          <w:highlight w:val="yellow"/>
         </w:rPr>
         <w:t>Das Burgerlogo im Kreis überlappt ein bisschen</w:t>
       </w:r>
@@ -420,13 +441,15 @@
           <w:rFonts w:ascii="Arial" w:hAnsi="Arial" w:cs="Arial"/>
           <w:sz w:val="22"/>
           <w:szCs w:val="22"/>
-        </w:rPr>
-      </w:pPr>
-      <w:r>
-        <w:rPr>
-          <w:rFonts w:ascii="Arial" w:hAnsi="Arial" w:cs="Arial"/>
-          <w:sz w:val="22"/>
-          <w:szCs w:val="22"/>
+          <w:highlight w:val="yellow"/>
+        </w:rPr>
+      </w:pPr>
+      <w:r>
+        <w:rPr>
+          <w:rFonts w:ascii="Arial" w:hAnsi="Arial" w:cs="Arial"/>
+          <w:sz w:val="22"/>
+          <w:szCs w:val="22"/>
+          <w:highlight w:val="yellow"/>
         </w:rPr>
         <w:t xml:space="preserve">Der Warenkorb ist nicht </w:t>
       </w:r>
@@ -436,6 +459,7 @@
           <w:rFonts w:ascii="Arial" w:hAnsi="Arial" w:cs="Arial"/>
           <w:sz w:val="22"/>
           <w:szCs w:val="22"/>
+          <w:highlight w:val="yellow"/>
         </w:rPr>
         <w:t>sticky</w:t>
       </w:r>
@@ -445,6 +469,7 @@
           <w:rFonts w:ascii="Arial" w:hAnsi="Arial" w:cs="Arial"/>
           <w:sz w:val="22"/>
           <w:szCs w:val="22"/>
+          <w:highlight w:val="yellow"/>
         </w:rPr>
         <w:t xml:space="preserve"> er bleibt nur an einer Stelle und man kann ihn weg scrollen</w:t>
       </w:r>
@@ -507,13 +532,15 @@
           <w:rFonts w:ascii="Arial" w:hAnsi="Arial" w:cs="Arial"/>
           <w:sz w:val="22"/>
           <w:szCs w:val="22"/>
-        </w:rPr>
-      </w:pPr>
-      <w:r>
-        <w:rPr>
-          <w:rFonts w:ascii="Arial" w:hAnsi="Arial" w:cs="Arial"/>
-          <w:sz w:val="22"/>
-          <w:szCs w:val="22"/>
+          <w:highlight w:val="yellow"/>
+        </w:rPr>
+      </w:pPr>
+      <w:r>
+        <w:rPr>
+          <w:rFonts w:ascii="Arial" w:hAnsi="Arial" w:cs="Arial"/>
+          <w:sz w:val="22"/>
+          <w:szCs w:val="22"/>
+          <w:highlight w:val="yellow"/>
         </w:rPr>
         <w:t>Bei dem Warenkorb bei de</w:t>
       </w:r>
@@ -522,6 +549,7 @@
           <w:rFonts w:ascii="Arial" w:hAnsi="Arial" w:cs="Arial"/>
           <w:sz w:val="22"/>
           <w:szCs w:val="22"/>
+          <w:highlight w:val="yellow"/>
         </w:rPr>
         <w:t>m</w:t>
       </w:r>
@@ -530,6 +558,7 @@
           <w:rFonts w:ascii="Arial" w:hAnsi="Arial" w:cs="Arial"/>
           <w:sz w:val="22"/>
           <w:szCs w:val="22"/>
+          <w:highlight w:val="yellow"/>
         </w:rPr>
         <w:t xml:space="preserve"> Buy </w:t>
       </w:r>
@@ -539,6 +568,7 @@
           <w:rFonts w:ascii="Arial" w:hAnsi="Arial" w:cs="Arial"/>
           <w:sz w:val="22"/>
           <w:szCs w:val="22"/>
+          <w:highlight w:val="yellow"/>
         </w:rPr>
         <w:t>Now</w:t>
       </w:r>
@@ -548,6 +578,7 @@
           <w:rFonts w:ascii="Arial" w:hAnsi="Arial" w:cs="Arial"/>
           <w:sz w:val="22"/>
           <w:szCs w:val="22"/>
+          <w:highlight w:val="yellow"/>
         </w:rPr>
         <w:t xml:space="preserve"> Button steht kein Preis</w:t>
       </w:r>
@@ -563,13 +594,15 @@
           <w:rFonts w:ascii="Arial" w:hAnsi="Arial" w:cs="Arial"/>
           <w:sz w:val="22"/>
           <w:szCs w:val="22"/>
-        </w:rPr>
-      </w:pPr>
-      <w:r>
-        <w:rPr>
-          <w:rFonts w:ascii="Arial" w:hAnsi="Arial" w:cs="Arial"/>
-          <w:sz w:val="22"/>
-          <w:szCs w:val="22"/>
+          <w:highlight w:val="yellow"/>
+        </w:rPr>
+      </w:pPr>
+      <w:r>
+        <w:rPr>
+          <w:rFonts w:ascii="Arial" w:hAnsi="Arial" w:cs="Arial"/>
+          <w:sz w:val="22"/>
+          <w:szCs w:val="22"/>
+          <w:highlight w:val="yellow"/>
         </w:rPr>
         <w:t xml:space="preserve">Den Abstand zwischen </w:t>
       </w:r>
@@ -579,6 +612,7 @@
           <w:rFonts w:ascii="Arial" w:hAnsi="Arial" w:cs="Arial"/>
           <w:sz w:val="22"/>
           <w:szCs w:val="22"/>
+          <w:highlight w:val="yellow"/>
         </w:rPr>
         <w:t>Subtotal</w:t>
       </w:r>
@@ -588,6 +622,7 @@
           <w:rFonts w:ascii="Arial" w:hAnsi="Arial" w:cs="Arial"/>
           <w:sz w:val="22"/>
           <w:szCs w:val="22"/>
+          <w:highlight w:val="yellow"/>
         </w:rPr>
         <w:t xml:space="preserve"> und Versandkosten reduzieren</w:t>
       </w:r>
@@ -987,13 +1022,15 @@
           <w:rFonts w:ascii="Arial" w:hAnsi="Arial" w:cs="Arial"/>
           <w:sz w:val="22"/>
           <w:szCs w:val="22"/>
-        </w:rPr>
-      </w:pPr>
-      <w:r>
-        <w:rPr>
-          <w:rFonts w:ascii="Arial" w:hAnsi="Arial" w:cs="Arial"/>
-          <w:sz w:val="22"/>
-          <w:szCs w:val="22"/>
+          <w:highlight w:val="yellow"/>
+        </w:rPr>
+      </w:pPr>
+      <w:r>
+        <w:rPr>
+          <w:rFonts w:ascii="Arial" w:hAnsi="Arial" w:cs="Arial"/>
+          <w:sz w:val="22"/>
+          <w:szCs w:val="22"/>
+          <w:highlight w:val="yellow"/>
         </w:rPr>
         <w:t xml:space="preserve">Die Gerichte im Warenkorb brauchen eine maximale Höhe damit man nicht lange nach unten scrollen </w:t>
       </w:r>
@@ -1003,6 +1040,7 @@
           <w:rFonts w:ascii="Arial" w:hAnsi="Arial" w:cs="Arial"/>
           <w:sz w:val="22"/>
           <w:szCs w:val="22"/>
+          <w:highlight w:val="yellow"/>
         </w:rPr>
         <w:t>muss</w:t>
       </w:r>
@@ -1012,6 +1050,7 @@
           <w:rFonts w:ascii="Arial" w:hAnsi="Arial" w:cs="Arial"/>
           <w:sz w:val="22"/>
           <w:szCs w:val="22"/>
+          <w:highlight w:val="yellow"/>
         </w:rPr>
         <w:t xml:space="preserve"> um den Button zu sehen und das sollten von der Höhe der Gerichte beschränkt sein</w:t>
       </w:r>
@@ -1034,6 +1073,7 @@
           <w:rFonts w:ascii="Arial" w:hAnsi="Arial" w:cs="Arial"/>
           <w:sz w:val="22"/>
           <w:szCs w:val="22"/>
+          <w:highlight w:val="yellow"/>
         </w:rPr>
         <w:t xml:space="preserve">Bei responsive die </w:t>
       </w:r>
@@ -1043,6 +1083,7 @@
           <w:rFonts w:ascii="Arial" w:hAnsi="Arial" w:cs="Arial"/>
           <w:sz w:val="22"/>
           <w:szCs w:val="22"/>
+          <w:highlight w:val="yellow"/>
         </w:rPr>
         <w:t>Contentbegrenzung</w:t>
       </w:r>
@@ -1052,6 +1093,7 @@
           <w:rFonts w:ascii="Arial" w:hAnsi="Arial" w:cs="Arial"/>
           <w:sz w:val="22"/>
           <w:szCs w:val="22"/>
+          <w:highlight w:val="yellow"/>
         </w:rPr>
         <w:t xml:space="preserve"> beachten (</w:t>
       </w:r>
@@ -1061,6 +1103,7 @@
           <w:rFonts w:ascii="Arial" w:hAnsi="Arial" w:cs="Arial"/>
           <w:sz w:val="22"/>
           <w:szCs w:val="22"/>
+          <w:highlight w:val="yellow"/>
         </w:rPr>
         <w:t>BestellApp</w:t>
       </w:r>
@@ -1070,6 +1113,7 @@
           <w:rFonts w:ascii="Arial" w:hAnsi="Arial" w:cs="Arial"/>
           <w:sz w:val="22"/>
           <w:szCs w:val="22"/>
+          <w:highlight w:val="yellow"/>
         </w:rPr>
         <w:t xml:space="preserve"> Logo, Warenkorb)</w:t>
       </w:r>
@@ -1154,13 +1198,15 @@
           <w:rFonts w:ascii="Arial" w:hAnsi="Arial" w:cs="Arial"/>
           <w:sz w:val="22"/>
           <w:szCs w:val="22"/>
-        </w:rPr>
-      </w:pPr>
-      <w:r>
-        <w:rPr>
-          <w:rFonts w:ascii="Arial" w:hAnsi="Arial" w:cs="Arial"/>
-          <w:sz w:val="22"/>
-          <w:szCs w:val="22"/>
+          <w:highlight w:val="blue"/>
+        </w:rPr>
+      </w:pPr>
+      <w:r>
+        <w:rPr>
+          <w:rFonts w:ascii="Arial" w:hAnsi="Arial" w:cs="Arial"/>
+          <w:sz w:val="22"/>
+          <w:szCs w:val="22"/>
+          <w:highlight w:val="blue"/>
         </w:rPr>
         <w:lastRenderedPageBreak/>
         <w:t>Handy Warenkorb muss allgemein nochmal angepasst werden (bricht sehr raus)</w:t>

</xml_diff>